<commit_message>
added Annex B.1 report
</commit_message>
<xml_diff>
--- a/reports_output/tools_equipment_1_2026.docx
+++ b/reports_output/tools_equipment_1_2026.docx
@@ -28,20 +28,20 @@
         </w:rPr>
       </w:pPr>
       <w:r>
-        <w:t>Generated by: Admin</w:t>
-      </w:r>
-    </w:p>
-    <w:p>
-      <w:pPr>
-        <w:keepNext/>
-        <w:spacing w:after="0" w:line="240" w:lineRule="auto"/>
-        <w:jc w:val="both"/>
-        <w:rPr>
-          <w:rFonts w:ascii="Arial" w:eastAsia="Arial" w:hAnsi="Arial" w:cs="Arial"/>
-        </w:rPr>
-      </w:pPr>
-      <w:r>
-        <w:t>Date &amp; Time Generated: 2026-01-13 14:52:00</w:t>
+        <w:t>Generated by: Secretary</w:t>
+      </w:r>
+    </w:p>
+    <w:p>
+      <w:pPr>
+        <w:keepNext/>
+        <w:spacing w:after="0" w:line="240" w:lineRule="auto"/>
+        <w:jc w:val="both"/>
+        <w:rPr>
+          <w:rFonts w:ascii="Arial" w:eastAsia="Arial" w:hAnsi="Arial" w:cs="Arial"/>
+        </w:rPr>
+      </w:pPr>
+      <w:r>
+        <w:t>Date &amp; Time Generated: 2026-02-26 21:39:03</w:t>
       </w:r>
     </w:p>
     <w:p>
@@ -611,7 +611,7 @@
         </w:rPr>
       </w:pPr>
       <w:r>
-        <w:t>Total Number of Excellent Items: 0</w:t>
+        <w:t>Total Number of Excellent Items: 1</w:t>
       </w:r>
     </w:p>
     <w:p>

</xml_diff>